<commit_message>
Use Senior Software Engineer as the Will Bank title
Will Bank's career ladder had no mobile/backend distinction, and the role
covered Flutter, backend services, database and infra.

Co-Authored-By: Claude Opus 5.5 <noreply@anthropic.com>
Claude-Session: https://claude.ai/code/session_014tF2mZxbJZvQiCs7QA6cz7
</commit_message>
<xml_diff>
--- a/dist/Lucas-Selani-CV-AI-EN.docx
+++ b/dist/Lucas-Selani-CV-AI-EN.docx
@@ -424,13 +424,13 @@
       </w:r>
     </w:p>
     <w:bookmarkEnd w:id="15"/>
-    <w:bookmarkStart w:id="16" w:name="X66342713ef45284539785e4a93c028bf5058582"/>
+    <w:bookmarkStart w:id="16" w:name="X5fa9e1a3689497e53ace60aa8bba5d331803a73"/>
     <w:p>
       <w:pPr>
         <w:pStyle w:val="Heading3"/>
       </w:pPr>
       <w:r>
-        <w:t xml:space="preserve">Senior Mobile Engineer — Will Bank | Nov 2024 – Jul 2026</w:t>
+        <w:t xml:space="preserve">Senior Software Engineer — Will Bank | Nov 2024 – Jul 2026</w:t>
       </w:r>
     </w:p>
     <w:p>

</xml_diff>

<commit_message>
Set Unico promotion to Jan 2023, Toodoo as hybrid, Darkrunner dates
Co-Authored-By: Claude Opus 5.5 <noreply@anthropic.com>
Claude-Session: https://claude.ai/code/session_014tF2mZxbJZvQiCs7QA6cz7
</commit_message>
<xml_diff>
--- a/dist/Lucas-Selani-CV-AI-EN.docx
+++ b/dist/Lucas-Selani-CV-AI-EN.docx
@@ -214,13 +214,13 @@
         <w:t xml:space="preserve">AI Projects</w:t>
       </w:r>
     </w:p>
-    <w:bookmarkStart w:id="13" w:name="Xa34b65ed36674125f107f665f03d3f855a9703b"/>
+    <w:bookmarkStart w:id="13" w:name="Xafe1ca22a6aa29362928beca450bbeb72484561"/>
     <w:p>
       <w:pPr>
         <w:pStyle w:val="Heading3"/>
       </w:pPr>
       <w:r>
-        <w:t xml:space="preserve">Darkrunner — multi-agent video pipeline (TypeScript/Node.js, private)</w:t>
+        <w:t xml:space="preserve">Darkrunner — multi-agent video pipeline (TypeScript/Node.js, private) | Nov 2025 – Apr 2026</w:t>
       </w:r>
     </w:p>
     <w:p>
@@ -616,7 +616,7 @@
           <w:i/>
           <w:iCs/>
         </w:rPr>
-        <w:t xml:space="preserve">Brazil’s leader in digital identity · Remote · Joined as Software Developer, promoted to Senior (IC5) in 2022.</w:t>
+        <w:t xml:space="preserve">Brazil’s leader in digital identity · Remote · Joined as Software Developer, promoted to Senior (IC5) in Jan 2023.</w:t>
       </w:r>
     </w:p>
     <w:p>

</xml_diff>

<commit_message>
Split Unico work by promotion date and add observability tooling
- Unico: Core Module, CI/CD automation and Segment/Firebase instrumentation
  before the Jan 2023 promotion; super-app architecture, Design System,
  release train, New Relic + incident.io on-call alerting and the move to
  LaunchDarkly/Mixpanel after it
- Will Bank: Datadog and PostHog dashboards for flow health, user-journey
  drop-off and error debugging
- Skills and LinkedIn fields updated to match

Co-Authored-By: Claude Opus 5.5 <noreply@anthropic.com>
Claude-Session: https://claude.ai/code/session_014tF2mZxbJZvQiCs7QA6cz7
</commit_message>
<xml_diff>
--- a/dist/Lucas-Selani-CV-AI-EN.docx
+++ b/dist/Lucas-Selani-CV-AI-EN.docx
@@ -179,7 +179,7 @@
         <w:t xml:space="preserve"> </w:t>
       </w:r>
       <w:r>
-        <w:t xml:space="preserve">Microservices, REST APIs, PostgreSQL, Redis, AWS, GCP, Docker, Kubernetes, Terraform, CI/CD (GitHub Actions)</w:t>
+        <w:t xml:space="preserve">Microservices, REST APIs, PostgreSQL, Redis, AWS, GCP, Docker, Kubernetes, Terraform, CI/CD (GitHub Actions), Datadog, New Relic, PostHog</w:t>
       </w:r>
     </w:p>
     <w:p>
@@ -597,6 +597,18 @@
         <w:t xml:space="preserve">Wrote RFCs and ADRs for the migration, the move to SDUI and a refactor that added events and logs to the fraud prevention package.</w:t>
       </w:r>
     </w:p>
+    <w:p>
+      <w:pPr>
+        <w:pStyle w:val="Compact"/>
+        <w:numPr>
+          <w:ilvl w:val="0"/>
+          <w:numId w:val="1004"/>
+        </w:numPr>
+      </w:pPr>
+      <w:r>
+        <w:t xml:space="preserve">Built Datadog and PostHog dashboards for flow health, user-journey drop-off and error debugging.</w:t>
+      </w:r>
+    </w:p>
     <w:bookmarkEnd w:id="16"/>
     <w:bookmarkStart w:id="17" w:name="X2bd682157e125f4fdf3e0812a38bd5f2a0f60e1"/>
     <w:p>
@@ -628,7 +640,7 @@
         </w:numPr>
       </w:pPr>
       <w:r>
-        <w:t xml:space="preserve">Architected and scaled a multi-module</w:t>
+        <w:t xml:space="preserve">Architected a multi-module</w:t>
       </w:r>
       <w:r>
         <w:t xml:space="preserve"> </w:t>
@@ -657,7 +669,7 @@
         <w:t xml:space="preserve">200k+ active users</w:t>
       </w:r>
       <w:r>
-        <w:t xml:space="preserve">, with facial biometrics and digital documents, its Core Module, Design System and CI/CD release train.</w:t>
+        <w:t xml:space="preserve">, with its Core Module, Design System, CI/CD release train and on-call alerting (New Relic, incident.io).</w:t>
       </w:r>
     </w:p>
     <w:p>

</xml_diff>

<commit_message>
Name GrowthBook as Will Bank's feature flag platform
Co-Authored-By: Claude Opus 5.5 <noreply@anthropic.com>
Claude-Session: https://claude.ai/code/session_014tF2mZxbJZvQiCs7QA6cz7
</commit_message>
<xml_diff>
--- a/dist/Lucas-Selani-CV-AI-EN.docx
+++ b/dist/Lucas-Selani-CV-AI-EN.docx
@@ -582,7 +582,23 @@
         <w:t xml:space="preserve"> </w:t>
       </w:r>
       <w:r>
-        <w:t xml:space="preserve">behind a feature flag.</w:t>
+        <w:t xml:space="preserve">behind a</w:t>
+      </w:r>
+      <w:r>
+        <w:t xml:space="preserve"> </w:t>
+      </w:r>
+      <w:r>
+        <w:rPr>
+          <w:b/>
+          <w:bCs/>
+        </w:rPr>
+        <w:t xml:space="preserve">GrowthBook</w:t>
+      </w:r>
+      <w:r>
+        <w:t xml:space="preserve"> </w:t>
+      </w:r>
+      <w:r>
+        <w:t xml:space="preserve">feature flag.</w:t>
       </w:r>
     </w:p>
     <w:p>

</xml_diff>